<commit_message>
Found Routing issue with Burpsuite and Updated the Report File
</commit_message>
<xml_diff>
--- a/Security & Testing/Sreenivasa Pai/Enumeration/Nmap/test report on verccel app.docx
+++ b/Security & Testing/Sreenivasa Pai/Enumeration/Nmap/test report on verccel app.docx
@@ -2,6 +2,51 @@
 <file path=word/document.xml><?xml version="1.0" encoding="utf-8"?>
 <w:document xmlns:wpc="http://schemas.microsoft.com/office/word/2010/wordprocessingCanvas" xmlns:cx="http://schemas.microsoft.com/office/drawing/2014/chartex" xmlns:cx1="http://schemas.microsoft.com/office/drawing/2015/9/8/chartex" xmlns:cx2="http://schemas.microsoft.com/office/drawing/2015/10/21/chartex" xmlns:cx3="http://schemas.microsoft.com/office/drawing/2016/5/9/chartex" xmlns:cx4="http://schemas.microsoft.com/office/drawing/2016/5/10/chartex" xmlns:cx5="http://schemas.microsoft.com/office/drawing/2016/5/11/chartex" xmlns:cx6="http://schemas.microsoft.com/office/drawing/2016/5/12/chartex" xmlns:cx7="http://schemas.microsoft.com/office/drawing/2016/5/13/chartex" xmlns:cx8="http://schemas.microsoft.com/office/drawing/2016/5/14/chartex" xmlns:mc="http://schemas.openxmlformats.org/markup-compatibility/2006" xmlns:aink="http://schemas.microsoft.com/office/drawing/2016/ink" xmlns:am3d="http://schemas.microsoft.com/office/drawing/2017/model3d" xmlns:o="urn:schemas-microsoft-com:office:office" xmlns:oel="http://schemas.microsoft.com/office/2019/extlst" xmlns:r="http://schemas.openxmlformats.org/officeDocument/2006/relationships" xmlns:m="http://schemas.openxmlformats.org/officeDocument/2006/math" xmlns:v="urn:schemas-microsoft-com:vml" xmlns:wp14="http://schemas.microsoft.com/office/word/2010/wordprocessingDrawing" xmlns:wp="http://schemas.openxmlformats.org/drawingml/2006/wordprocessingDrawing" xmlns:w10="urn:schemas-microsoft-com:office:word" xmlns:w="http://schemas.openxmlformats.org/wordprocessingml/2006/main" xmlns:w14="http://schemas.microsoft.com/office/word/2010/wordml" xmlns:w15="http://schemas.microsoft.com/office/word/2012/wordml" xmlns:w16cex="http://schemas.microsoft.com/office/word/2018/wordml/cex" xmlns:w16cid="http://schemas.microsoft.com/office/word/2016/wordml/cid" xmlns:w16="http://schemas.microsoft.com/office/word/2018/wordml" xmlns:w16du="http://schemas.microsoft.com/office/word/2023/wordml/word16du" xmlns:w16sdtdh="http://schemas.microsoft.com/office/word/2020/wordml/sdtdatahash" xmlns:w16sdtfl="http://schemas.microsoft.com/office/word/2024/wordml/sdtformatlock" xmlns:w16se="http://schemas.microsoft.com/office/word/2015/wordml/symex" xmlns:wpg="http://schemas.microsoft.com/office/word/2010/wordprocessingGroup" xmlns:wpi="http://schemas.microsoft.com/office/word/2010/wordprocessingInk" xmlns:wne="http://schemas.microsoft.com/office/word/2006/wordml" xmlns:wps="http://schemas.microsoft.com/office/word/2010/wordprocessingShape" mc:Ignorable="w14 w15 w16se w16cid w16 w16cex w16sdtdh w16sdtfl w16du wp14">
   <w:body>
+    <w:p/>
+    <w:p>
+      <w:r>
+        <w:drawing>
+          <wp:inline distT="0" distB="0" distL="0" distR="0" wp14:anchorId="55553111" wp14:editId="40482E25">
+            <wp:extent cx="14608806" cy="7369179"/>
+            <wp:effectExtent l="0" t="0" r="3175" b="3175"/>
+            <wp:docPr id="1759844583" name="Picture 1"/>
+            <wp:cNvGraphicFramePr>
+              <a:graphicFrameLocks xmlns:a="http://schemas.openxmlformats.org/drawingml/2006/main" noChangeAspect="1"/>
+            </wp:cNvGraphicFramePr>
+            <a:graphic xmlns:a="http://schemas.openxmlformats.org/drawingml/2006/main">
+              <a:graphicData uri="http://schemas.openxmlformats.org/drawingml/2006/picture">
+                <pic:pic xmlns:pic="http://schemas.openxmlformats.org/drawingml/2006/picture">
+                  <pic:nvPicPr>
+                    <pic:cNvPr id="1759844583" name=""/>
+                    <pic:cNvPicPr/>
+                  </pic:nvPicPr>
+                  <pic:blipFill>
+                    <a:blip r:embed="rId4"/>
+                    <a:stretch>
+                      <a:fillRect/>
+                    </a:stretch>
+                  </pic:blipFill>
+                  <pic:spPr>
+                    <a:xfrm>
+                      <a:off x="0" y="0"/>
+                      <a:ext cx="14608806" cy="7369179"/>
+                    </a:xfrm>
+                    <a:prstGeom prst="rect">
+                      <a:avLst/>
+                    </a:prstGeom>
+                  </pic:spPr>
+                </pic:pic>
+              </a:graphicData>
+            </a:graphic>
+          </wp:inline>
+        </w:drawing>
+      </w:r>
+    </w:p>
+    <w:p>
+      <w:r>
+        <w:t xml:space="preserve">Test in this version before further changes </w:t>
+      </w:r>
+    </w:p>
     <w:p>
       <w:r>
         <w:rPr>
@@ -23,7 +68,7 @@
                     <pic:cNvPicPr/>
                   </pic:nvPicPr>
                   <pic:blipFill>
-                    <a:blip r:embed="rId4"/>
+                    <a:blip r:embed="rId5"/>
                     <a:stretch>
                       <a:fillRect/>
                     </a:stretch>
@@ -66,7 +111,7 @@
                     <pic:cNvPicPr/>
                   </pic:nvPicPr>
                   <pic:blipFill>
-                    <a:blip r:embed="rId5"/>
+                    <a:blip r:embed="rId6"/>
                     <a:stretch>
                       <a:fillRect/>
                     </a:stretch>
@@ -102,6 +147,9 @@
     </w:p>
     <w:p>
       <w:r>
+        <w:rPr>
+          <w:noProof/>
+        </w:rPr>
         <w:drawing>
           <wp:inline distT="0" distB="0" distL="0" distR="0" wp14:anchorId="0EAC301E" wp14:editId="7EBEB9C0">
             <wp:extent cx="5845047" cy="4016088"/>
@@ -118,7 +166,7 @@
                     <pic:cNvPicPr/>
                   </pic:nvPicPr>
                   <pic:blipFill>
-                    <a:blip r:embed="rId6"/>
+                    <a:blip r:embed="rId7"/>
                     <a:stretch>
                       <a:fillRect/>
                     </a:stretch>
@@ -160,7 +208,7 @@
                     <pic:cNvPicPr/>
                   </pic:nvPicPr>
                   <pic:blipFill>
-                    <a:blip r:embed="rId7"/>
+                    <a:blip r:embed="rId8"/>
                     <a:stretch>
                       <a:fillRect/>
                     </a:stretch>
@@ -223,6 +271,9 @@
     </w:p>
     <w:p>
       <w:r>
+        <w:rPr>
+          <w:noProof/>
+        </w:rPr>
         <w:drawing>
           <wp:inline distT="0" distB="0" distL="0" distR="0" wp14:anchorId="7E4CE2CB" wp14:editId="66A58E1D">
             <wp:extent cx="5456393" cy="3010161"/>
@@ -239,7 +290,7 @@
                     <pic:cNvPicPr/>
                   </pic:nvPicPr>
                   <pic:blipFill>
-                    <a:blip r:embed="rId8"/>
+                    <a:blip r:embed="rId9"/>
                     <a:stretch>
                       <a:fillRect/>
                     </a:stretch>
@@ -312,6 +363,9 @@
     <w:p/>
     <w:p>
       <w:r>
+        <w:rPr>
+          <w:noProof/>
+        </w:rPr>
         <w:drawing>
           <wp:inline distT="0" distB="0" distL="0" distR="0" wp14:anchorId="06D9233E" wp14:editId="5329B36D">
             <wp:extent cx="5921253" cy="4694327"/>
@@ -328,7 +382,7 @@
                     <pic:cNvPicPr/>
                   </pic:nvPicPr>
                   <pic:blipFill>
-                    <a:blip r:embed="rId9"/>
+                    <a:blip r:embed="rId10"/>
                     <a:stretch>
                       <a:fillRect/>
                     </a:stretch>
@@ -375,7 +429,7 @@
                     <pic:cNvPicPr/>
                   </pic:nvPicPr>
                   <pic:blipFill>
-                    <a:blip r:embed="rId10"/>
+                    <a:blip r:embed="rId11"/>
                     <a:stretch>
                       <a:fillRect/>
                     </a:stretch>
@@ -398,6 +452,9 @@
     </w:p>
     <w:p>
       <w:r>
+        <w:rPr>
+          <w:noProof/>
+        </w:rPr>
         <w:drawing>
           <wp:inline distT="0" distB="0" distL="0" distR="0" wp14:anchorId="3D628D2F" wp14:editId="08CF263C">
             <wp:extent cx="5921253" cy="5654530"/>
@@ -414,7 +471,7 @@
                     <pic:cNvPicPr/>
                   </pic:nvPicPr>
                   <pic:blipFill>
-                    <a:blip r:embed="rId11"/>
+                    <a:blip r:embed="rId12"/>
                     <a:stretch>
                       <a:fillRect/>
                     </a:stretch>
@@ -1163,6 +1220,7 @@
   <w:style w:type="character" w:default="1" w:styleId="DefaultParagraphFont">
     <w:name w:val="Default Paragraph Font"/>
     <w:uiPriority w:val="1"/>
+    <w:semiHidden/>
     <w:unhideWhenUsed/>
   </w:style>
   <w:style w:type="table" w:default="1" w:styleId="TableNormal">

</xml_diff>